<commit_message>
Add public GitHub URL and drop Word lock file.
Co-authored-by: Cursor <cursoragent@cursor.com>
</commit_message>
<xml_diff>
--- a/Manuscript_Trials_R1.docx
+++ b/Manuscript_Trials_R1.docx
@@ -532,7 +532,7 @@
           <w:i w:val="0"/>
           <w:sz w:val="24"/>
         </w:rPr>
-        <w:t>Analyses used Python 3.9+ (NumPy, SciPy, pandas). Code, extraction tables, and posterior draws are in the reproducibility package submitted as an additional file.</w:t>
+        <w:t>Analyses used Python 3.9+ (NumPy, SciPy, pandas). Code, extraction tables, and posterior draws are at https://github.com/rstil2/infectious-disease-trial-sex-enrollment and in Additional File 1.</w:t>
       </w:r>
     </w:p>
     <w:p>
@@ -896,7 +896,7 @@
           <w:i w:val="0"/>
           <w:sz w:val="24"/>
         </w:rPr>
-        <w:t>**Availability of data and materials:** Extraction tables, screening log, analysis code, and posterior draws are in Additional File 1 (reproducibility package). All source counts are from cited publications and ClinicalTrials.gov.</w:t>
+        <w:t>**Availability of data and materials:** Extraction tables, screening log, analysis code, and posterior draws are at https://github.com/rstil2/infectious-disease-trial-sex-enrollment (MIT license) and in Additional File 1. All source counts are from cited publications and ClinicalTrials.gov.</w:t>
       </w:r>
     </w:p>
     <w:p>

</xml_diff>